<commit_message>
Update portfolio: add Metz phase, fix DiamGrain 2024, push updated CVs
</commit_message>
<xml_diff>
--- a/DEBAB_Amine_CV_EN_2026.docx
+++ b/DEBAB_Amine_CV_EN_2026.docx
@@ -7,6 +7,14 @@
         <w:tblW w:type="auto" w:w="0"/>
         <w:tblLook w:firstColumn="1" w:firstRow="1" w:lastColumn="0" w:lastRow="0" w:noHBand="0" w:noVBand="1" w:val="04A0"/>
         <w:tblW w:w="11340" w:type="dxa"/>
+        <w:tblBorders>
+          <w:top w:val="none"/>
+          <w:left w:val="none"/>
+          <w:bottom w:val="none"/>
+          <w:right w:val="none"/>
+          <w:insideH w:val="none"/>
+          <w:insideV w:val="none"/>
+        </w:tblBorders>
       </w:tblPr>
       <w:tblGrid>
         <w:gridCol w:w="5670"/>
@@ -18,11 +26,18 @@
             <w:tcW w:w="3515" w:type="dxa"/>
             <w:tcW w:type="dxa" w:w="5670"/>
             <w:shd w:val="clear" w:color="auto" w:fill="1A2942"/>
+            <w:tcBorders>
+              <w:top w:val="none"/>
+              <w:left w:val="none"/>
+              <w:bottom w:val="none"/>
+              <w:right w:val="none"/>
+            </w:tcBorders>
           </w:tcPr>
           <w:p/>
           <w:p>
             <w:pPr>
-              <w:spacing w:before="240" w:after="40"/>
+              <w:spacing w:before="280" w:after="40"/>
+              <w:ind w:left="0"/>
             </w:pPr>
             <w:r>
               <w:rPr>
@@ -37,6 +52,7 @@
           <w:p>
             <w:pPr>
               <w:spacing w:before="0" w:after="40"/>
+              <w:ind w:left="0"/>
             </w:pPr>
             <w:r>
               <w:rPr>
@@ -51,6 +67,7 @@
           <w:p>
             <w:pPr>
               <w:spacing w:before="0" w:after="200"/>
+              <w:ind w:left="0"/>
             </w:pPr>
             <w:r>
               <w:rPr>
@@ -64,7 +81,8 @@
           </w:p>
           <w:p>
             <w:pPr>
-              <w:spacing w:before="120" w:after="60"/>
+              <w:spacing w:before="80" w:after="60"/>
+              <w:ind w:left="0"/>
             </w:pPr>
             <w:r>
               <w:rPr>
@@ -79,6 +97,7 @@
           <w:p>
             <w:pPr>
               <w:spacing w:before="0" w:after="40"/>
+              <w:ind w:left="0"/>
             </w:pPr>
             <w:r>
               <w:rPr>
@@ -93,6 +112,7 @@
           <w:p>
             <w:pPr>
               <w:spacing w:before="0" w:after="40"/>
+              <w:ind w:left="0"/>
             </w:pPr>
             <w:r>
               <w:rPr>
@@ -107,6 +127,7 @@
           <w:p>
             <w:pPr>
               <w:spacing w:before="0" w:after="40"/>
+              <w:ind w:left="0"/>
             </w:pPr>
             <w:r>
               <w:rPr>
@@ -121,6 +142,7 @@
           <w:p>
             <w:pPr>
               <w:spacing w:before="0" w:after="40"/>
+              <w:ind w:left="0"/>
             </w:pPr>
             <w:r>
               <w:rPr>
@@ -135,6 +157,7 @@
           <w:p>
             <w:pPr>
               <w:spacing w:before="0" w:after="160"/>
+              <w:ind w:left="0"/>
             </w:pPr>
             <w:r>
               <w:rPr>
@@ -149,6 +172,7 @@
           <w:p>
             <w:pPr>
               <w:spacing w:before="80" w:after="60"/>
+              <w:ind w:left="0"/>
             </w:pPr>
             <w:r>
               <w:rPr>
@@ -163,6 +187,7 @@
           <w:p>
             <w:pPr>
               <w:spacing w:before="0" w:after="40"/>
+              <w:ind w:left="0"/>
             </w:pPr>
             <w:r>
               <w:rPr>
@@ -177,6 +202,7 @@
           <w:p>
             <w:pPr>
               <w:spacing w:before="0" w:after="160"/>
+              <w:ind w:left="0"/>
             </w:pPr>
             <w:r>
               <w:rPr>
@@ -191,6 +217,7 @@
           <w:p>
             <w:pPr>
               <w:spacing w:before="80" w:after="60"/>
+              <w:ind w:left="0"/>
             </w:pPr>
             <w:r>
               <w:rPr>
@@ -205,6 +232,7 @@
           <w:p>
             <w:pPr>
               <w:spacing w:before="0" w:after="20"/>
+              <w:ind w:left="0"/>
             </w:pPr>
             <w:r>
               <w:rPr>
@@ -219,6 +247,7 @@
           <w:p>
             <w:pPr>
               <w:spacing w:before="0" w:after="20"/>
+              <w:ind w:left="0"/>
             </w:pPr>
             <w:r>
               <w:rPr>
@@ -227,12 +256,13 @@
                 <w:color w:val="B8C5D6"/>
                 <w:sz w:val="16"/>
               </w:rPr>
-              <w:t>USTO University, 2011</w:t>
+              <w:t>Université USTO, 2011</w:t>
             </w:r>
           </w:p>
           <w:p>
             <w:pPr>
               <w:spacing w:before="0" w:after="160"/>
+              <w:ind w:left="0"/>
             </w:pPr>
             <w:r>
               <w:rPr>
@@ -247,6 +277,7 @@
           <w:p>
             <w:pPr>
               <w:spacing w:before="80" w:after="60"/>
+              <w:ind w:left="0"/>
             </w:pPr>
             <w:r>
               <w:rPr>
@@ -261,6 +292,7 @@
           <w:p>
             <w:pPr>
               <w:spacing w:before="0" w:after="40"/>
+              <w:ind w:left="0"/>
             </w:pPr>
             <w:r>
               <w:rPr>
@@ -275,6 +307,7 @@
           <w:p>
             <w:pPr>
               <w:spacing w:before="0" w:after="40"/>
+              <w:ind w:left="0"/>
             </w:pPr>
             <w:r>
               <w:rPr>
@@ -283,12 +316,13 @@
                 <w:color w:val="B8C5D6"/>
                 <w:sz w:val="16"/>
               </w:rPr>
-              <w:t>▪ CMMS / GMAO (advanced Excel)</w:t>
+              <w:t>▪ CMMS / GMAO (Advanced Excel)</w:t>
             </w:r>
           </w:p>
           <w:p>
             <w:pPr>
               <w:spacing w:before="0" w:after="40"/>
+              <w:ind w:left="0"/>
             </w:pPr>
             <w:r>
               <w:rPr>
@@ -303,6 +337,7 @@
           <w:p>
             <w:pPr>
               <w:spacing w:before="0" w:after="40"/>
+              <w:ind w:left="0"/>
             </w:pPr>
             <w:r>
               <w:rPr>
@@ -317,6 +352,7 @@
           <w:p>
             <w:pPr>
               <w:spacing w:before="0" w:after="40"/>
+              <w:ind w:left="0"/>
             </w:pPr>
             <w:r>
               <w:rPr>
@@ -331,6 +367,7 @@
           <w:p>
             <w:pPr>
               <w:spacing w:before="0" w:after="40"/>
+              <w:ind w:left="0"/>
             </w:pPr>
             <w:r>
               <w:rPr>
@@ -345,6 +382,7 @@
           <w:p>
             <w:pPr>
               <w:spacing w:before="120" w:after="60"/>
+              <w:ind w:left="0"/>
             </w:pPr>
             <w:r>
               <w:rPr>
@@ -359,6 +397,7 @@
           <w:p>
             <w:pPr>
               <w:spacing w:before="0" w:after="40"/>
+              <w:ind w:left="0"/>
             </w:pPr>
             <w:r>
               <w:rPr>
@@ -373,6 +412,7 @@
           <w:p>
             <w:pPr>
               <w:spacing w:before="0" w:after="40"/>
+              <w:ind w:left="0"/>
             </w:pPr>
             <w:r>
               <w:rPr>
@@ -387,6 +427,7 @@
           <w:p>
             <w:pPr>
               <w:spacing w:before="0" w:after="40"/>
+              <w:ind w:left="0"/>
             </w:pPr>
             <w:r>
               <w:rPr>
@@ -401,6 +442,7 @@
           <w:p>
             <w:pPr>
               <w:spacing w:before="0" w:after="40"/>
+              <w:ind w:left="0"/>
             </w:pPr>
             <w:r>
               <w:rPr>
@@ -415,6 +457,7 @@
           <w:p>
             <w:pPr>
               <w:spacing w:before="0" w:after="40"/>
+              <w:ind w:left="0"/>
             </w:pPr>
             <w:r>
               <w:rPr>
@@ -429,6 +472,7 @@
           <w:p>
             <w:pPr>
               <w:spacing w:before="0" w:after="40"/>
+              <w:ind w:left="0"/>
             </w:pPr>
             <w:r>
               <w:rPr>
@@ -442,7 +486,23 @@
           </w:p>
           <w:p>
             <w:pPr>
+              <w:spacing w:before="0" w:after="40"/>
+              <w:ind w:left="0"/>
+            </w:pPr>
+            <w:r>
+              <w:rPr>
+                <w:b w:val="0"/>
+                <w:i w:val="0"/>
+                <w:color w:val="B8C5D6"/>
+                <w:sz w:val="16"/>
+              </w:rPr>
+              <w:t>▪ Training &amp; Recruitment</w:t>
+            </w:r>
+          </w:p>
+          <w:p>
+            <w:pPr>
               <w:spacing w:before="120" w:after="60"/>
+              <w:ind w:left="0"/>
             </w:pPr>
             <w:r>
               <w:rPr>
@@ -457,6 +517,7 @@
           <w:p>
             <w:pPr>
               <w:spacing w:before="0" w:after="40"/>
+              <w:ind w:left="0"/>
             </w:pPr>
             <w:r>
               <w:rPr>
@@ -465,12 +526,13 @@
                 <w:color w:val="B8C5D6"/>
                 <w:sz w:val="16"/>
               </w:rPr>
-              <w:t>▪ Electrical accreditation H0V, B1V, BR</w:t>
+              <w:t>▪ H0V, B1V, BR (Schneider)</w:t>
             </w:r>
           </w:p>
           <w:p>
             <w:pPr>
               <w:spacing w:before="0" w:after="160"/>
+              <w:ind w:left="0"/>
             </w:pPr>
             <w:r>
               <w:rPr>
@@ -485,6 +547,7 @@
           <w:p>
             <w:pPr>
               <w:spacing w:before="80" w:after="60"/>
+              <w:ind w:left="0"/>
             </w:pPr>
             <w:r>
               <w:rPr>
@@ -499,6 +562,7 @@
           <w:p>
             <w:pPr>
               <w:spacing w:before="0" w:after="40"/>
+              <w:ind w:left="0"/>
             </w:pPr>
             <w:r>
               <w:rPr>
@@ -513,6 +577,7 @@
           <w:p>
             <w:pPr>
               <w:spacing w:before="0" w:after="160"/>
+              <w:ind w:left="0"/>
             </w:pPr>
             <w:r>
               <w:rPr>
@@ -530,11 +595,17 @@
             <w:tcW w:w="7824" w:type="dxa"/>
             <w:tcW w:type="dxa" w:w="5670"/>
             <w:shd w:val="clear" w:color="auto" w:fill="FFFFFF"/>
+            <w:tcBorders>
+              <w:top w:val="none"/>
+              <w:left w:val="none"/>
+              <w:bottom w:val="none"/>
+              <w:right w:val="none"/>
+            </w:tcBorders>
           </w:tcPr>
           <w:p/>
           <w:p>
             <w:pPr>
-              <w:spacing w:before="240" w:after="120"/>
+              <w:spacing w:before="240" w:after="80"/>
             </w:pPr>
             <w:r>
               <w:rPr>
@@ -547,7 +618,8 @@
           </w:p>
           <w:p>
             <w:pPr>
-              <w:spacing w:before="40" w:after="200"/>
+              <w:spacing w:before="40" w:after="160"/>
+              <w:ind w:left="0"/>
             </w:pPr>
             <w:r>
               <w:rPr>
@@ -556,7 +628,7 @@
                 <w:color w:val="2D3748"/>
                 <w:sz w:val="18"/>
               </w:rPr>
-              <w:t>With over 14 years of international experience in industrial maintenance, production management and project management, I have grown from field engineer to Sr. Technician PMO &amp; Reliability at Amazon. Expert in Reliability Engineering, site commissioning and RME service implementation (Reliability structure, shift management, CMMS, OEE/DPMO improvement), I drive technical performance through data-driven analysis and multicultural team leadership (15+ nationalities).</w:t>
+              <w:t>With over 14 years of international experience across industrial maintenance, production management and project management, I have grown from field engineer in Algeria to Sr. Technician PMO &amp; Reliability at Amazon in France. Expert in Reliability Engineering, site commissioning and RME service implementation (Reliability structure, shift management, CMMS, OEE/DPMO improvement), I drive technical performance through data-driven analysis and multicultural team leadership.</w:t>
             </w:r>
           </w:p>
           <w:p>
@@ -577,7 +649,7 @@
           </w:p>
           <w:p>
             <w:pPr>
-              <w:spacing w:before="120" w:after="40"/>
+              <w:spacing w:before="120" w:after="20"/>
             </w:pPr>
             <w:r>
               <w:rPr>
@@ -596,84 +668,183 @@
               <w:rPr>
                 <w:i/>
                 <w:color w:val="5C6B7A"/>
-                <w:sz w:val="18"/>
+                <w:sz w:val="17"/>
               </w:rPr>
-              <w:t>Amazon Fulfillment Center, Lyon – France  |  04/2026 – Present</w:t>
+              <w:t>Amazon Fulfillment Center LYS2, Lyon – France  |  04/2026 – Present</w:t>
             </w:r>
           </w:p>
           <w:p>
             <w:pPr>
-              <w:pStyle w:val="ListBullet"/>
               <w:spacing w:before="0" w:after="20"/>
-              <w:ind w:left="200"/>
+              <w:ind w:left="160"/>
             </w:pPr>
             <w:r>
               <w:rPr>
                 <w:color w:val="2D3748"/>
                 <w:sz w:val="18"/>
               </w:rPr>
-              <w:t>Project management and full commissioning of a new fulfillment center</w:t>
+              <w:t>•  Full commissioning project management of a new fulfillment center</w:t>
             </w:r>
           </w:p>
           <w:p>
             <w:pPr>
-              <w:pStyle w:val="ListBullet"/>
               <w:spacing w:before="0" w:after="20"/>
-              <w:ind w:left="200"/>
+              <w:ind w:left="160"/>
             </w:pPr>
             <w:r>
               <w:rPr>
                 <w:color w:val="2D3748"/>
                 <w:sz w:val="18"/>
               </w:rPr>
-              <w:t>Implemented RME (Reliability Maintenance Engineering) service from the ground up</w:t>
+              <w:t>•  Built RME service from scratch: Reliability structure, PM programs, CMMS, OEE KPIs</w:t>
             </w:r>
           </w:p>
           <w:p>
             <w:pPr>
-              <w:pStyle w:val="ListBullet"/>
               <w:spacing w:before="0" w:after="20"/>
-              <w:ind w:left="200"/>
+              <w:ind w:left="160"/>
             </w:pPr>
             <w:r>
               <w:rPr>
                 <w:color w:val="2D3748"/>
                 <w:sz w:val="18"/>
               </w:rPr>
-              <w:t>Set up Reliability structure: PM programs, CMMS, OEE KPIs and jam DPMO tracking</w:t>
+              <w:t>•  Set up and managed maintenance shift system</w:t>
             </w:r>
           </w:p>
           <w:p>
             <w:pPr>
-              <w:pStyle w:val="ListBullet"/>
               <w:spacing w:before="0" w:after="20"/>
-              <w:ind w:left="200"/>
+              <w:ind w:left="160"/>
             </w:pPr>
             <w:r>
               <w:rPr>
                 <w:color w:val="2D3748"/>
                 <w:sz w:val="18"/>
               </w:rPr>
-              <w:t>Shift management and multicultural team building (15+ nationalities)</w:t>
+              <w:t>•  Recruited and led multicultural engineering team (15+ nationalities)</w:t>
             </w:r>
           </w:p>
           <w:p>
             <w:pPr>
-              <w:pStyle w:val="ListBullet"/>
+              <w:spacing w:before="120" w:after="20"/>
+            </w:pPr>
+            <w:r>
+              <w:rPr>
+                <w:b/>
+                <w:color w:val="1A2942"/>
+                <w:sz w:val="20"/>
+              </w:rPr>
+              <w:t>Sr. Reliability Maintenance Engineering Technician (SRMET)</w:t>
+            </w:r>
+          </w:p>
+          <w:p>
+            <w:pPr>
+              <w:spacing w:before="0" w:after="40"/>
+            </w:pPr>
+            <w:r>
+              <w:rPr>
+                <w:i/>
+                <w:color w:val="5C6B7A"/>
+                <w:sz w:val="17"/>
+              </w:rPr>
+              <w:t>Amazon Fulfillment Center ETZ2, Metz – France  |  07/2024 – 03/2026</w:t>
+            </w:r>
+          </w:p>
+          <w:p>
+            <w:pPr>
               <w:spacing w:before="0" w:after="20"/>
-              <w:ind w:left="200"/>
+              <w:ind w:left="160"/>
             </w:pPr>
             <w:r>
               <w:rPr>
                 <w:color w:val="2D3748"/>
                 <w:sz w:val="18"/>
               </w:rPr>
-              <w:t>Continuous improvement of site OEE and JAM DPMO (target 95%+ OEE)</w:t>
+              <w:t>•  Full autonomous shift management as sole technical reference on shift</w:t>
             </w:r>
           </w:p>
           <w:p>
             <w:pPr>
-              <w:spacing w:before="120" w:after="40"/>
+              <w:spacing w:before="0" w:after="20"/>
+              <w:ind w:left="160"/>
+            </w:pPr>
+            <w:r>
+              <w:rPr>
+                <w:color w:val="2D3748"/>
+                <w:sz w:val="18"/>
+              </w:rPr>
+              <w:t>•  Maintenance backlog management and corrective intervention scheduling</w:t>
+            </w:r>
+          </w:p>
+          <w:p>
+            <w:pPr>
+              <w:spacing w:before="0" w:after="20"/>
+              <w:ind w:left="160"/>
+            </w:pPr>
+            <w:r>
+              <w:rPr>
+                <w:color w:val="2D3748"/>
+                <w:sz w:val="18"/>
+              </w:rPr>
+              <w:t>•  Technician supervision and coordination during interventions</w:t>
+            </w:r>
+          </w:p>
+          <w:p>
+            <w:pPr>
+              <w:spacing w:before="0" w:after="20"/>
+              <w:ind w:left="160"/>
+            </w:pPr>
+            <w:r>
+              <w:rPr>
+                <w:color w:val="2D3748"/>
+                <w:sz w:val="18"/>
+              </w:rPr>
+              <w:t>•  HIE (High Impact Event) management: investigation, escalation and corrective actions</w:t>
+            </w:r>
+          </w:p>
+          <w:p>
+            <w:pPr>
+              <w:spacing w:before="0" w:after="20"/>
+              <w:ind w:left="160"/>
+            </w:pPr>
+            <w:r>
+              <w:rPr>
+                <w:color w:val="2D3748"/>
+                <w:sz w:val="18"/>
+              </w:rPr>
+              <w:t>•  Trained and recruited 2 apprentices (both converted to permanent contracts)</w:t>
+            </w:r>
+          </w:p>
+          <w:p>
+            <w:pPr>
+              <w:spacing w:before="0" w:after="20"/>
+              <w:ind w:left="160"/>
+            </w:pPr>
+            <w:r>
+              <w:rPr>
+                <w:color w:val="2D3748"/>
+                <w:sz w:val="18"/>
+              </w:rPr>
+              <w:t>•  Automated JAM DPMO reporting with Python: 3h → 20 min (-89%)</w:t>
+            </w:r>
+          </w:p>
+          <w:p>
+            <w:pPr>
+              <w:spacing w:before="0" w:after="20"/>
+              <w:ind w:left="160"/>
+            </w:pPr>
+            <w:r>
+              <w:rPr>
+                <w:color w:val="2D3748"/>
+                <w:sz w:val="18"/>
+              </w:rPr>
+              <w:t>•  SLAM OEE maintained &gt;95% — flash report template adopted as site standard</w:t>
+            </w:r>
+          </w:p>
+          <w:p>
+            <w:pPr>
+              <w:spacing w:before="120" w:after="20"/>
             </w:pPr>
             <w:r>
               <w:rPr>
@@ -692,70 +863,66 @@
               <w:rPr>
                 <w:i/>
                 <w:color w:val="5C6B7A"/>
-                <w:sz w:val="18"/>
+                <w:sz w:val="17"/>
               </w:rPr>
-              <w:t>DiamGrain, Ouedtlelat – Algeria  |  01/2021 – 01/2026</w:t>
+              <w:t>DiamGrain, Ouedtlelat – Algeria  |  01/2021 – 06/2024</w:t>
             </w:r>
           </w:p>
           <w:p>
             <w:pPr>
-              <w:pStyle w:val="ListBullet"/>
               <w:spacing w:before="0" w:after="20"/>
-              <w:ind w:left="200"/>
+              <w:ind w:left="160"/>
             </w:pPr>
             <w:r>
               <w:rPr>
                 <w:color w:val="2D3748"/>
                 <w:sz w:val="18"/>
               </w:rPr>
-              <w:t>Project manager for utility service implementation (boilers, air compressors, water treatment)</w:t>
+              <w:t>•  Project manager for utility service setup (boilers, air compressors, water treatment)</w:t>
             </w:r>
           </w:p>
           <w:p>
             <w:pPr>
-              <w:pStyle w:val="ListBullet"/>
               <w:spacing w:before="0" w:after="20"/>
-              <w:ind w:left="200"/>
+              <w:ind w:left="160"/>
             </w:pPr>
             <w:r>
               <w:rPr>
                 <w:color w:val="2D3748"/>
                 <w:sz w:val="18"/>
               </w:rPr>
-              <w:t>Built maintenance department from scratch – CMMS in Excel with PM/CM tracking</w:t>
+              <w:t>•  Built maintenance department from scratch with Excel CMMS (PM + CM tracking)</w:t>
             </w:r>
           </w:p>
           <w:p>
             <w:pPr>
-              <w:pStyle w:val="ListBullet"/>
               <w:spacing w:before="0" w:after="20"/>
-              <w:ind w:left="200"/>
+              <w:ind w:left="160"/>
             </w:pPr>
             <w:r>
               <w:rPr>
                 <w:color w:val="2D3748"/>
                 <w:sz w:val="18"/>
               </w:rPr>
-              <w:t>Developed Arduino monitoring system (1,650 EUR vs 12,000 EUR commercial solution, ROI 3.5 months)</w:t>
+              <w:t>•  Developed Arduino monitoring system: €1,650 vs €12,000 commercial — ROI 3.5 months</w:t>
             </w:r>
           </w:p>
           <w:p>
             <w:pPr>
-              <w:pStyle w:val="ListBullet"/>
               <w:spacing w:before="0" w:after="20"/>
-              <w:ind w:left="200"/>
+              <w:ind w:left="160"/>
             </w:pPr>
             <w:r>
               <w:rPr>
                 <w:color w:val="2D3748"/>
                 <w:sz w:val="18"/>
               </w:rPr>
-              <w:t>Equipment availability: 78% → 94% in 18 months | Unplanned stoppages: -60%</w:t>
+              <w:t>•  Equipment availability: 78% → 94% in 18 months | Unplanned stoppages: -60%</w:t>
             </w:r>
           </w:p>
           <w:p>
             <w:pPr>
-              <w:spacing w:before="120" w:after="40"/>
+              <w:spacing w:before="120" w:after="20"/>
             </w:pPr>
             <w:r>
               <w:rPr>
@@ -774,56 +941,53 @@
               <w:rPr>
                 <w:i/>
                 <w:color w:val="5C6B7A"/>
-                <w:sz w:val="18"/>
+                <w:sz w:val="17"/>
               </w:rPr>
               <w:t>Linde Gaz, Arzew – Algeria  |  08/2016 – 01/2021</w:t>
             </w:r>
           </w:p>
           <w:p>
             <w:pPr>
-              <w:pStyle w:val="ListBullet"/>
               <w:spacing w:before="0" w:after="20"/>
-              <w:ind w:left="200"/>
+              <w:ind w:left="160"/>
             </w:pPr>
             <w:r>
               <w:rPr>
                 <w:color w:val="2D3748"/>
                 <w:sz w:val="18"/>
               </w:rPr>
-              <w:t>Commissioning of N2O production line (850 kg/day, €1.2M project) – 3 weeks ahead of schedule</w:t>
+              <w:t>•  N2O line commissioning (850 kg/day, €1.2M project) – 3 weeks ahead of schedule</w:t>
             </w:r>
           </w:p>
           <w:p>
             <w:pPr>
-              <w:pStyle w:val="ListBullet"/>
               <w:spacing w:before="0" w:after="20"/>
-              <w:ind w:left="200"/>
+              <w:ind w:left="160"/>
             </w:pPr>
             <w:r>
               <w:rPr>
                 <w:color w:val="2D3748"/>
                 <w:sz w:val="18"/>
               </w:rPr>
-              <w:t>Lead auditor for ISO 9001, 45001, 50001 – all 3 certifications in 14 months</w:t>
+              <w:t>•  Lead auditor ISO 9001, 45001, 50001 – all 3 certifications in 14 months</w:t>
             </w:r>
           </w:p>
           <w:p>
             <w:pPr>
-              <w:pStyle w:val="ListBullet"/>
               <w:spacing w:before="0" w:after="20"/>
-              <w:ind w:left="200"/>
+              <w:ind w:left="160"/>
             </w:pPr>
             <w:r>
               <w:rPr>
                 <w:color w:val="2D3748"/>
                 <w:sz w:val="18"/>
               </w:rPr>
-              <w:t>Line availability: 82% → 97% | Maintenance cost: -32% (€85k → €58k/year)</w:t>
+              <w:t>•  Line availability: 82% → 97% | Maintenance cost: -32%</w:t>
             </w:r>
           </w:p>
           <w:p>
             <w:pPr>
-              <w:spacing w:before="120" w:after="40"/>
+              <w:spacing w:before="120" w:after="20"/>
             </w:pPr>
             <w:r>
               <w:rPr>
@@ -842,56 +1006,53 @@
               <w:rPr>
                 <w:i/>
                 <w:color w:val="5C6B7A"/>
-                <w:sz w:val="18"/>
+                <w:sz w:val="17"/>
               </w:rPr>
               <w:t>Sonelgaz, Arzew – Algeria  |  11/2014 – 08/2016</w:t>
             </w:r>
           </w:p>
           <w:p>
             <w:pPr>
-              <w:pStyle w:val="ListBullet"/>
               <w:spacing w:before="0" w:after="20"/>
-              <w:ind w:left="200"/>
+              <w:ind w:left="160"/>
             </w:pPr>
             <w:r>
               <w:rPr>
                 <w:color w:val="2D3748"/>
                 <w:sz w:val="18"/>
               </w:rPr>
-              <w:t>Acting Agency Director (12,000 subscribers, 24 staff)</w:t>
+              <w:t>•  Acting Agency Director (12,000 subscribers, 24 staff)</w:t>
             </w:r>
           </w:p>
           <w:p>
             <w:pPr>
-              <w:pStyle w:val="ListBullet"/>
               <w:spacing w:before="0" w:after="20"/>
-              <w:ind w:left="200"/>
+              <w:ind w:left="160"/>
             </w:pPr>
             <w:r>
               <w:rPr>
                 <w:color w:val="2D3748"/>
                 <w:sz w:val="18"/>
               </w:rPr>
-              <w:t>Created Access database for network anomaly tracking</w:t>
+              <w:t>•  Built Access database for network anomaly tracking</w:t>
             </w:r>
           </w:p>
           <w:p>
             <w:pPr>
-              <w:pStyle w:val="ListBullet"/>
               <w:spacing w:before="0" w:after="20"/>
-              <w:ind w:left="200"/>
+              <w:ind w:left="160"/>
             </w:pPr>
             <w:r>
               <w:rPr>
                 <w:color w:val="2D3748"/>
                 <w:sz w:val="18"/>
               </w:rPr>
-              <w:t>Annual report lead time reduced: 3 weeks → 4 hours</w:t>
+              <w:t>•  Annual report lead time: 3 weeks → 4 hours</w:t>
             </w:r>
           </w:p>
           <w:p>
             <w:pPr>
-              <w:spacing w:before="120" w:after="40"/>
+              <w:spacing w:before="120" w:after="20"/>
             </w:pPr>
             <w:r>
               <w:rPr>
@@ -910,28 +1071,27 @@
               <w:rPr>
                 <w:i/>
                 <w:color w:val="5C6B7A"/>
-                <w:sz w:val="18"/>
+                <w:sz w:val="17"/>
               </w:rPr>
               <w:t>Mobiserve, Algiers – Algeria  |  04/2014 – 11/2014</w:t>
             </w:r>
           </w:p>
           <w:p>
             <w:pPr>
-              <w:pStyle w:val="ListBullet"/>
               <w:spacing w:before="0" w:after="20"/>
-              <w:ind w:left="200"/>
+              <w:ind w:left="160"/>
             </w:pPr>
             <w:r>
               <w:rPr>
                 <w:color w:val="2D3748"/>
                 <w:sz w:val="18"/>
               </w:rPr>
-              <w:t>4G network rollout in Western Algeria – maintenance of Siemens/Huawei cabinets</w:t>
+              <w:t>•  4G network rollout in Western Algeria – Siemens/Huawei cabinet maintenance</w:t>
             </w:r>
           </w:p>
           <w:p>
             <w:pPr>
-              <w:spacing w:before="120" w:after="40"/>
+              <w:spacing w:before="120" w:after="20"/>
             </w:pPr>
             <w:r>
               <w:rPr>
@@ -950,42 +1110,27 @@
               <w:rPr>
                 <w:i/>
                 <w:color w:val="5C6B7A"/>
-                <w:sz w:val="18"/>
+                <w:sz w:val="17"/>
               </w:rPr>
               <w:t>FerobMetal, Oran – Algeria  |  08/2012 – 04/2014</w:t>
             </w:r>
           </w:p>
           <w:p>
             <w:pPr>
-              <w:pStyle w:val="ListBullet"/>
               <w:spacing w:before="0" w:after="20"/>
-              <w:ind w:left="200"/>
+              <w:ind w:left="160"/>
             </w:pPr>
             <w:r>
               <w:rPr>
                 <w:color w:val="2D3748"/>
                 <w:sz w:val="18"/>
               </w:rPr>
-              <w:t>Electrical and mechanical assembly of aluminium profile extruders</w:t>
+              <w:t>•  Electrical and mechanical assembly of aluminium extruders | Production and maintenance oversight</w:t>
             </w:r>
           </w:p>
           <w:p>
             <w:pPr>
-              <w:pStyle w:val="ListBullet"/>
-              <w:spacing w:before="0" w:after="20"/>
-              <w:ind w:left="200"/>
-            </w:pPr>
-            <w:r>
-              <w:rPr>
-                <w:color w:val="2D3748"/>
-                <w:sz w:val="18"/>
-              </w:rPr>
-              <w:t>Supervised production and maintenance operations</w:t>
-            </w:r>
-          </w:p>
-          <w:p>
-            <w:pPr>
-              <w:spacing w:before="120" w:after="40"/>
+              <w:spacing w:before="120" w:after="20"/>
             </w:pPr>
             <w:r>
               <w:rPr>
@@ -1004,23 +1149,22 @@
               <w:rPr>
                 <w:i/>
                 <w:color w:val="5C6B7A"/>
-                <w:sz w:val="18"/>
+                <w:sz w:val="17"/>
               </w:rPr>
               <w:t>MHI, Oran – Algeria  |  01/2012 – 08/2012</w:t>
             </w:r>
           </w:p>
           <w:p>
             <w:pPr>
-              <w:pStyle w:val="ListBullet"/>
               <w:spacing w:before="0" w:after="20"/>
-              <w:ind w:left="200"/>
+              <w:ind w:left="160"/>
             </w:pPr>
             <w:r>
               <w:rPr>
                 <w:color w:val="2D3748"/>
                 <w:sz w:val="18"/>
               </w:rPr>
-              <w:t>Installation of electrical equipment and cabinets, pre-commissioning and commissioning</w:t>
+              <w:t>•  Installation of electrical equipment and cabinets, pre-commissioning and commissioning</w:t>
             </w:r>
           </w:p>
         </w:tc>

</xml_diff>

<commit_message>
CVs updated: add profile photo + portfolio hyperlink to FR & EN
</commit_message>
<xml_diff>
--- a/DEBAB_Amine_CV_EN_2026.docx
+++ b/DEBAB_Amine_CV_EN_2026.docx
@@ -33,7 +33,46 @@
               <w:right w:val="none"/>
             </w:tcBorders>
           </w:tcPr>
-          <w:p/>
+          <w:p>
+            <w:pPr>
+              <w:jc w:val="center"/>
+              <w:spacing w:before="60" w:after="100"/>
+            </w:pPr>
+            <w:r>
+              <w:drawing>
+                <wp:inline xmlns:a="http://schemas.openxmlformats.org/drawingml/2006/main" xmlns:pic="http://schemas.openxmlformats.org/drawingml/2006/picture">
+                  <wp:extent cx="1224000" cy="1561515"/>
+                  <wp:docPr id="1" name="Picture 1"/>
+                  <wp:cNvGraphicFramePr>
+                    <a:graphicFrameLocks noChangeAspect="1"/>
+                  </wp:cNvGraphicFramePr>
+                  <a:graphic>
+                    <a:graphicData uri="http://schemas.openxmlformats.org/drawingml/2006/picture">
+                      <pic:pic>
+                        <pic:nvPicPr>
+                          <pic:cNvPr id="0" name="cv_photo_clean.jpg"/>
+                          <pic:cNvPicPr/>
+                        </pic:nvPicPr>
+                        <pic:blipFill>
+                          <a:blip r:embed="rId9"/>
+                          <a:stretch>
+                            <a:fillRect/>
+                          </a:stretch>
+                        </pic:blipFill>
+                        <pic:spPr>
+                          <a:xfrm>
+                            <a:off x="0" y="0"/>
+                            <a:ext cx="1224000" cy="1561515"/>
+                          </a:xfrm>
+                          <a:prstGeom prst="rect"/>
+                        </pic:spPr>
+                      </pic:pic>
+                    </a:graphicData>
+                  </a:graphic>
+                </wp:inline>
+              </w:drawing>
+            </w:r>
+          </w:p>
           <w:p>
             <w:pPr>
               <w:spacing w:before="280" w:after="40"/>
@@ -161,13 +200,23 @@
             </w:pPr>
             <w:r>
               <w:rPr>
-                <w:b w:val="0"/>
-                <w:i w:val="0"/>
                 <w:color w:val="B8C5D6"/>
-                <w:sz w:val="16"/>
+                <w:sz w:val="18"/>
+                <w:szCs w:val="18"/>
               </w:rPr>
-              <w:t>🌐 aminedebab.github.io/Portfolio</w:t>
+              <w:t xml:space="preserve">🌐  </w:t>
             </w:r>
+            <w:hyperlink r:id="rId10">
+              <w:r>
+                <w:rPr>
+                  <w:color w:val="6AABCF"/>
+                  <w:u w:val="single"/>
+                  <w:sz w:val="18"/>
+                  <w:szCs w:val="18"/>
+                </w:rPr>
+                <w:t>aminedebab.github.io/Portfolio</w:t>
+              </w:r>
+            </w:hyperlink>
           </w:p>
           <w:p>
             <w:pPr>
@@ -844,6 +893,80 @@
           </w:p>
           <w:p>
             <w:pPr>
+              <w:spacing w:before="120"/>
+            </w:pPr>
+            <w:r>
+              <w:rPr>
+                <w:b/>
+                <w:color w:val="1A2942"/>
+                <w:sz w:val="20"/>
+                <w:szCs w:val="20"/>
+              </w:rPr>
+              <w:t>Production Supervisor</w:t>
+            </w:r>
+          </w:p>
+          <w:p>
+            <w:pPr/>
+            <w:r>
+              <w:rPr>
+                <w:color w:val="5C6B7A"/>
+                <w:sz w:val="17"/>
+                <w:szCs w:val="17"/>
+              </w:rPr>
+              <w:t>Greif, France</w:t>
+            </w:r>
+            <w:r>
+              <w:rPr>
+                <w:color w:val="5C6B7A"/>
+                <w:sz w:val="17"/>
+                <w:szCs w:val="17"/>
+              </w:rPr>
+              <w:t xml:space="preserve">  |</w:t>
+            </w:r>
+            <w:r>
+              <w:rPr>
+                <w:color w:val="5C6B7A"/>
+                <w:sz w:val="17"/>
+                <w:szCs w:val="17"/>
+              </w:rPr>
+              <w:t xml:space="preserve">  10/2023 – 06/2024</w:t>
+            </w:r>
+          </w:p>
+          <w:p>
+            <w:pPr/>
+            <w:r>
+              <w:rPr>
+                <w:color w:val="2D3748"/>
+                <w:sz w:val="18"/>
+                <w:szCs w:val="18"/>
+              </w:rPr>
+              <w:t>•  Supervised industrial drum manufacturing production lines (steel &amp; HDPE)</w:t>
+            </w:r>
+          </w:p>
+          <w:p>
+            <w:pPr/>
+            <w:r>
+              <w:rPr>
+                <w:color w:val="2D3748"/>
+                <w:sz w:val="18"/>
+                <w:szCs w:val="18"/>
+              </w:rPr>
+              <w:t>•  Managed production teams, planned and scheduled daily tasks</w:t>
+            </w:r>
+          </w:p>
+          <w:p>
+            <w:pPr/>
+            <w:r>
+              <w:rPr>
+                <w:color w:val="2D3748"/>
+                <w:sz w:val="18"/>
+                <w:szCs w:val="18"/>
+              </w:rPr>
+              <w:t>•  Implemented and enforced HSE rules and procedures on the shop floor</w:t>
+            </w:r>
+          </w:p>
+          <w:p>
+            <w:pPr>
               <w:spacing w:before="120" w:after="20"/>
             </w:pPr>
             <w:r>
@@ -865,7 +988,7 @@
                 <w:color w:val="5C6B7A"/>
                 <w:sz w:val="17"/>
               </w:rPr>
-              <w:t>DiamGrain, Ouedtlelat – Algeria  |  01/2021 – 06/2024</w:t>
+              <w:t>DiamGrain, Ouedtlelat – Algeria  |  01/2021 – 10/2023</w:t>
             </w:r>
           </w:p>
           <w:p>

</xml_diff>